<commit_message>
Docs opruimen: weg met verouderde PDF, poster naar tools/
Verwijderd:
- docs/make_pdf.py — reportlab-script voor een verouderde
  tech-samenvatting (7 modules, 24 tabellen). Opvolger is
  docs/project-samenvatting.md, PDF desgewenst via pandoc.
- docs/InlineComp_Samenvatting.pdf — de gegenereerde output van
  bovenstaande, inhoudelijk achterhaald.

Verplaatst:
- poster_gen.py + poster-inlinecomp.pdf: root → tools/
  Losse hulp-scripts horen niet in de project-root; tools/ had
  al pdf_klassement.py staan, dus dit is een natuurlijke plek.

project-samenvatting.md + .docx bijgewerkt:
- 'Gerelateerde docs' verwijst niet meer naar de verwijderde PDF,
  maar geeft het pandoc-commando voor wie een PDF wil.
- Bestandsstructuur-overzicht toont tools/ met alle drie z'n
  scripts, root is schoner.

Co-Authored-By: Claude Opus 4.7 (1M context) <noreply@anthropic.com>
</commit_message>
<xml_diff>
--- a/docs/project-samenvatting.docx
+++ b/docs/project-samenvatting.docx
@@ -90,26 +90,20 @@
       <w:r>
         <w:t xml:space="preserve">— open vraagstuk voor robuustheid</w:t>
       </w:r>
-    </w:p>
-    <w:p>
-      <w:pPr>
-        <w:pStyle w:val="Compact"/>
-        <w:numPr>
-          <w:ilvl w:val="0"/>
-          <w:numId w:val="1001"/>
-        </w:numPr>
-      </w:pPr>
-      <w:r>
-        <w:rPr>
-          <w:rStyle w:val="VerbatimChar"/>
-        </w:rPr>
-        <w:t xml:space="preserve">InlineComp_Samenvatting.pdf</w:t>
-      </w:r>
-      <w:r>
-        <w:t xml:space="preserve"> </w:t>
-      </w:r>
-      <w:r>
-        <w:t xml:space="preserve">— vorige compacte PDF-versie (historisch)</w:t>
+      <w:r>
+        <w:t xml:space="preserve"> </w:t>
+      </w:r>
+      <w:r>
+        <w:t xml:space="preserve">Genereer een PDF-versie indien nodig via pandoc:</w:t>
+      </w:r>
+      <w:r>
+        <w:t xml:space="preserve"> </w:t>
+      </w:r>
+      <w:r>
+        <w:rPr>
+          <w:rStyle w:val="VerbatimChar"/>
+        </w:rPr>
+        <w:t xml:space="preserve">pandoc docs/project-samenvatting.md -o docs/project-samenvatting.pdf</w:t>
       </w:r>
     </w:p>
     <w:p>
@@ -7253,7 +7247,7 @@
         <w:rPr>
           <w:rStyle w:val="VerbatimChar"/>
         </w:rPr>
-        <w:t xml:space="preserve">│   ├── offline-modus-spec.md    open vraagstuk</w:t>
+        <w:t xml:space="preserve">│   └── offline-modus-spec.md    open vraagstuk</w:t>
       </w:r>
       <w:r>
         <w:br/>
@@ -7262,7 +7256,7 @@
         <w:rPr>
           <w:rStyle w:val="VerbatimChar"/>
         </w:rPr>
-        <w:t xml:space="preserve">│   └── InlineComp_Samenvatting.pdf  historische versie</w:t>
+        <w:t xml:space="preserve">│</w:t>
       </w:r>
       <w:r>
         <w:br/>
@@ -7271,6 +7265,78 @@
         <w:rPr>
           <w:rStyle w:val="VerbatimChar"/>
         </w:rPr>
+        <w:t xml:space="preserve">├── js/                          13 frontend-modules</w:t>
+      </w:r>
+      <w:r>
+        <w:br/>
+      </w:r>
+      <w:r>
+        <w:rPr>
+          <w:rStyle w:val="VerbatimChar"/>
+        </w:rPr>
+        <w:t xml:space="preserve">│   ├── app.js                   SPA-shell, routing, rol-gate</w:t>
+      </w:r>
+      <w:r>
+        <w:br/>
+      </w:r>
+      <w:r>
+        <w:rPr>
+          <w:rStyle w:val="VerbatimChar"/>
+        </w:rPr>
+        <w:t xml:space="preserve">│   ├── import.js / startlist.js / tijdschema.js / live.js / uitslag.js  module-UIs</w:t>
+      </w:r>
+      <w:r>
+        <w:br/>
+      </w:r>
+      <w:r>
+        <w:rPr>
+          <w:rStyle w:val="VerbatimChar"/>
+        </w:rPr>
+        <w:t xml:space="preserve">│   ├── instellingen.js          organisatie-beheer</w:t>
+      </w:r>
+      <w:r>
+        <w:br/>
+      </w:r>
+      <w:r>
+        <w:rPr>
+          <w:rStyle w:val="VerbatimChar"/>
+        </w:rPr>
+        <w:t xml:space="preserve">│   ├── gebruikers.js / rijders.js  gebruikers + AVG</w:t>
+      </w:r>
+      <w:r>
+        <w:br/>
+      </w:r>
+      <w:r>
+        <w:rPr>
+          <w:rStyle w:val="VerbatimChar"/>
+        </w:rPr>
+        <w:t xml:space="preserve">│   ├── klassement_serie_ui.js   serie-klassement wizard</w:t>
+      </w:r>
+      <w:r>
+        <w:br/>
+      </w:r>
+      <w:r>
+        <w:rPr>
+          <w:rStyle w:val="VerbatimChar"/>
+        </w:rPr>
+        <w:t xml:space="preserve">│   ├── ranking.js / print_module.js  rendering-helpers</w:t>
+      </w:r>
+      <w:r>
+        <w:br/>
+      </w:r>
+      <w:r>
+        <w:rPr>
+          <w:rStyle w:val="VerbatimChar"/>
+        </w:rPr>
+        <w:t xml:space="preserve">│   └── handleiding.js           per-module inline help</w:t>
+      </w:r>
+      <w:r>
+        <w:br/>
+      </w:r>
+      <w:r>
+        <w:rPr>
+          <w:rStyle w:val="VerbatimChar"/>
+        </w:rPr>
         <w:t xml:space="preserve">│</w:t>
       </w:r>
       <w:r>
@@ -7280,7 +7346,7 @@
         <w:rPr>
           <w:rStyle w:val="VerbatimChar"/>
         </w:rPr>
-        <w:t xml:space="preserve">├── js/                          13 frontend-modules</w:t>
+        <w:t xml:space="preserve">├── public/                      publieke pagina + PWA-manifest + SW</w:t>
       </w:r>
       <w:r>
         <w:br/>
@@ -7289,7 +7355,7 @@
         <w:rPr>
           <w:rStyle w:val="VerbatimChar"/>
         </w:rPr>
-        <w:t xml:space="preserve">│   ├── app.js                   SPA-shell, routing, rol-gate</w:t>
+        <w:t xml:space="preserve">├── coach/                       coach-view (self-contained)</w:t>
       </w:r>
       <w:r>
         <w:br/>
@@ -7298,7 +7364,7 @@
         <w:rPr>
           <w:rStyle w:val="VerbatimChar"/>
         </w:rPr>
-        <w:t xml:space="preserve">│   ├── import.js / startlist.js / tijdschema.js / live.js / uitslag.js  module-UIs</w:t>
+        <w:t xml:space="preserve">│</w:t>
       </w:r>
       <w:r>
         <w:br/>
@@ -7307,7 +7373,7 @@
         <w:rPr>
           <w:rStyle w:val="VerbatimChar"/>
         </w:rPr>
-        <w:t xml:space="preserve">│   ├── instellingen.js          organisatie-beheer</w:t>
+        <w:t xml:space="preserve">├── tools/                       losse scripts (geen onderdeel van webapp)</w:t>
       </w:r>
       <w:r>
         <w:br/>
@@ -7316,7 +7382,7 @@
         <w:rPr>
           <w:rStyle w:val="VerbatimChar"/>
         </w:rPr>
-        <w:t xml:space="preserve">│   ├── gebruikers.js / rijders.js  gebruikers + AVG</w:t>
+        <w:t xml:space="preserve">│   ├── pdf_klassement.py        KNSB-klassement PDF → JSON import helper</w:t>
       </w:r>
       <w:r>
         <w:br/>
@@ -7325,7 +7391,7 @@
         <w:rPr>
           <w:rStyle w:val="VerbatimChar"/>
         </w:rPr>
-        <w:t xml:space="preserve">│   ├── klassement_serie_ui.js   serie-klassement wizard</w:t>
+        <w:t xml:space="preserve">│   ├── poster_gen.py            promotie-poster generator (QR → /public)</w:t>
       </w:r>
       <w:r>
         <w:br/>
@@ -7334,70 +7400,7 @@
         <w:rPr>
           <w:rStyle w:val="VerbatimChar"/>
         </w:rPr>
-        <w:t xml:space="preserve">│   ├── ranking.js / print_module.js  rendering-helpers</w:t>
-      </w:r>
-      <w:r>
-        <w:br/>
-      </w:r>
-      <w:r>
-        <w:rPr>
-          <w:rStyle w:val="VerbatimChar"/>
-        </w:rPr>
-        <w:t xml:space="preserve">│   └── handleiding.js           per-module inline help</w:t>
-      </w:r>
-      <w:r>
-        <w:br/>
-      </w:r>
-      <w:r>
-        <w:rPr>
-          <w:rStyle w:val="VerbatimChar"/>
-        </w:rPr>
-        <w:t xml:space="preserve">│</w:t>
-      </w:r>
-      <w:r>
-        <w:br/>
-      </w:r>
-      <w:r>
-        <w:rPr>
-          <w:rStyle w:val="VerbatimChar"/>
-        </w:rPr>
-        <w:t xml:space="preserve">├── public/                      publieke pagina + PWA-manifest + SW</w:t>
-      </w:r>
-      <w:r>
-        <w:br/>
-      </w:r>
-      <w:r>
-        <w:rPr>
-          <w:rStyle w:val="VerbatimChar"/>
-        </w:rPr>
-        <w:t xml:space="preserve">├── coach/                       coach-view (self-contained)</w:t>
-      </w:r>
-      <w:r>
-        <w:br/>
-      </w:r>
-      <w:r>
-        <w:rPr>
-          <w:rStyle w:val="VerbatimChar"/>
-        </w:rPr>
-        <w:t xml:space="preserve">│</w:t>
-      </w:r>
-      <w:r>
-        <w:br/>
-      </w:r>
-      <w:r>
-        <w:rPr>
-          <w:rStyle w:val="VerbatimChar"/>
-        </w:rPr>
-        <w:t xml:space="preserve">├── tools/pdf_klassement.py      KNSB-klassement PDF → JSON import helper</w:t>
-      </w:r>
-      <w:r>
-        <w:br/>
-      </w:r>
-      <w:r>
-        <w:rPr>
-          <w:rStyle w:val="VerbatimChar"/>
-        </w:rPr>
-        <w:t xml:space="preserve">├── poster_gen.py                promotie-poster generator (QR → /public)</w:t>
+        <w:t xml:space="preserve">│   └── poster-inlinecomp.pdf    laatst gegenereerde poster</w:t>
       </w:r>
       <w:r>
         <w:br/>

</xml_diff>